<commit_message>
_Mona's Eyes_ came out
</commit_message>
<xml_diff>
--- a/cv/erez-volk-cv-en.docx
+++ b/cv/erez-volk-cv-en.docx
@@ -3130,6 +3130,98 @@
     </w:p>
     <w:p>
       <w:pPr>
+        <w:pStyle w:val="Work"/>
+        <w:rPr>
+          <w:lang w:val="en-US"/>
+        </w:rPr>
+      </w:pPr>
+      <w:r>
+        <w:rPr>
+          <w:lang w:val="en-US"/>
+        </w:rPr>
+        <w:t xml:space="preserve"/>
+      </w:r>
+    </w:p>
+    <w:p>
+      <w:pPr>
+        <w:pStyle w:val="Work"/>
+        <w:rPr>
+          <w:lang w:val="en-US"/>
+        </w:rPr>
+      </w:pPr>
+      <w:r>
+        <w:rPr>
+          <w:lang w:val="en-US"/>
+        </w:rPr>
+        <w:tab/>
+      </w:r>
+      <w:r>
+        <w:rPr>
+          <w:rStyle w:val="WorkNumber"/>
+          <w:lang w:val="en-US"/>
+        </w:rPr>
+        <w:t xml:space="preserve">31</w:t>
+      </w:r>
+      <w:r>
+        <w:rPr>
+          <w:lang w:val="en-US"/>
+        </w:rPr>
+        <w:tab/>
+      </w:r>
+      <w:r>
+        <w:rPr>
+          <w:rStyle w:val="BookTitle"/>
+          <w:lang w:val="en-US"/>
+        </w:rPr>
+        <w:t xml:space="preserve">Les yeux de Mona [Mona’s Eyes]</w:t>
+      </w:r>
+      <w:r>
+        <w:rPr>
+          <w:lang w:val="en-US"/>
+        </w:rPr>
+        <w:t xml:space="preserve"> </w:t>
+      </w:r>
+      <w:r>
+        <w:rPr>
+          <w:lang w:val="en-US"/>
+        </w:rPr>
+        <w:t xml:space="preserve">by</w:t>
+      </w:r>
+      <w:r>
+        <w:rPr>
+          <w:lang w:val="en-US"/>
+        </w:rPr>
+        <w:t xml:space="preserve"> Thomas Schlesser.</w:t>
+      </w:r>
+      <w:r>
+        <w:rPr>
+          <w:lang w:val="en-US"/>
+        </w:rPr>
+        <w:t xml:space="preserve"> </w:t>
+      </w:r>
+      <w:r>
+        <w:rPr>
+          <w:lang w:val="en-US"/>
+        </w:rPr>
+        <w:t xml:space="preserve">Zmora-Bitan, 2026.</w:t>
+      </w:r>
+    </w:p>
+    <w:p>
+      <w:pPr>
+        <w:pStyle w:val="Work"/>
+        <w:rPr>
+          <w:lang w:val="en-US"/>
+        </w:rPr>
+      </w:pPr>
+      <w:r>
+        <w:rPr>
+          <w:lang w:val="en-US"/>
+        </w:rPr>
+        <w:t xml:space="preserve"/>
+      </w:r>
+    </w:p>
+    <w:p>
+      <w:pPr>
         <w:rPr>
           <w:lang w:val="en-US"/>
         </w:rPr>
@@ -3199,7 +3291,7 @@
           <w:rStyle w:val="WorkNumber"/>
           <w:lang w:val="en-US"/>
         </w:rPr>
-        <w:t xml:space="preserve">31</w:t>
+        <w:t xml:space="preserve">32</w:t>
       </w:r>
       <w:r>
         <w:rPr>
@@ -3291,7 +3383,7 @@
           <w:rStyle w:val="WorkNumber"/>
           <w:lang w:val="en-US"/>
         </w:rPr>
-        <w:t xml:space="preserve">32</w:t>
+        <w:t xml:space="preserve">33</w:t>
       </w:r>
       <w:r>
         <w:rPr>
@@ -3383,7 +3475,7 @@
           <w:rStyle w:val="WorkNumber"/>
           <w:lang w:val="en-US"/>
         </w:rPr>
-        <w:t xml:space="preserve">33</w:t>
+        <w:t xml:space="preserve">34</w:t>
       </w:r>
       <w:r>
         <w:rPr>
@@ -3475,7 +3567,7 @@
           <w:rStyle w:val="WorkNumber"/>
           <w:lang w:val="en-US"/>
         </w:rPr>
-        <w:t xml:space="preserve">34</w:t>
+        <w:t xml:space="preserve">35</w:t>
       </w:r>
       <w:r>
         <w:rPr>
@@ -3567,7 +3659,7 @@
           <w:rStyle w:val="WorkNumber"/>
           <w:lang w:val="en-US"/>
         </w:rPr>
-        <w:t xml:space="preserve">35</w:t>
+        <w:t xml:space="preserve">36</w:t>
       </w:r>
       <w:r>
         <w:rPr>
@@ -3659,7 +3751,7 @@
           <w:rStyle w:val="WorkNumber"/>
           <w:lang w:val="en-US"/>
         </w:rPr>
-        <w:t xml:space="preserve">36</w:t>
+        <w:t xml:space="preserve">37</w:t>
       </w:r>
       <w:r>
         <w:rPr>
@@ -3751,7 +3843,7 @@
           <w:rStyle w:val="WorkNumber"/>
           <w:lang w:val="en-US"/>
         </w:rPr>
-        <w:t xml:space="preserve">37</w:t>
+        <w:t xml:space="preserve">38</w:t>
       </w:r>
       <w:r>
         <w:rPr>
@@ -3843,7 +3935,7 @@
           <w:rStyle w:val="WorkNumber"/>
           <w:lang w:val="en-US"/>
         </w:rPr>
-        <w:t xml:space="preserve">38</w:t>
+        <w:t xml:space="preserve">39</w:t>
       </w:r>
       <w:r>
         <w:rPr>
@@ -3935,7 +4027,7 @@
           <w:rStyle w:val="WorkNumber"/>
           <w:lang w:val="en-US"/>
         </w:rPr>
-        <w:t xml:space="preserve">39</w:t>
+        <w:t xml:space="preserve">40</w:t>
       </w:r>
       <w:r>
         <w:rPr>
@@ -4027,7 +4119,7 @@
           <w:rStyle w:val="WorkNumber"/>
           <w:lang w:val="en-US"/>
         </w:rPr>
-        <w:t xml:space="preserve">40</w:t>
+        <w:t xml:space="preserve">41</w:t>
       </w:r>
       <w:r>
         <w:rPr>
@@ -4119,7 +4211,7 @@
           <w:rStyle w:val="WorkNumber"/>
           <w:lang w:val="en-US"/>
         </w:rPr>
-        <w:t xml:space="preserve">41</w:t>
+        <w:t xml:space="preserve">42</w:t>
       </w:r>
       <w:r>
         <w:rPr>
@@ -4223,7 +4315,7 @@
           <w:rStyle w:val="WorkNumber"/>
           <w:lang w:val="en-US"/>
         </w:rPr>
-        <w:t xml:space="preserve">42</w:t>
+        <w:t xml:space="preserve">43</w:t>
       </w:r>
       <w:r>
         <w:rPr>
@@ -4327,7 +4419,7 @@
           <w:rStyle w:val="WorkNumber"/>
           <w:lang w:val="en-US"/>
         </w:rPr>
-        <w:t xml:space="preserve">43</w:t>
+        <w:t xml:space="preserve">44</w:t>
       </w:r>
       <w:r>
         <w:rPr>
@@ -4419,7 +4511,7 @@
           <w:rStyle w:val="WorkNumber"/>
           <w:lang w:val="en-US"/>
         </w:rPr>
-        <w:t xml:space="preserve">44</w:t>
+        <w:t xml:space="preserve">45</w:t>
       </w:r>
       <w:r>
         <w:rPr>
@@ -4511,7 +4603,7 @@
           <w:rStyle w:val="WorkNumber"/>
           <w:lang w:val="en-US"/>
         </w:rPr>
-        <w:t xml:space="preserve">45</w:t>
+        <w:t xml:space="preserve">46</w:t>
       </w:r>
       <w:r>
         <w:rPr>
@@ -4642,7 +4734,7 @@
           <w:rStyle w:val="WorkNumber"/>
           <w:lang w:val="en-US"/>
         </w:rPr>
-        <w:t xml:space="preserve">46</w:t>
+        <w:t xml:space="preserve">47</w:t>
       </w:r>
       <w:r>
         <w:rPr>
@@ -4734,7 +4826,7 @@
           <w:rStyle w:val="WorkNumber"/>
           <w:lang w:val="en-US"/>
         </w:rPr>
-        <w:t xml:space="preserve">47</w:t>
+        <w:t xml:space="preserve">48</w:t>
       </w:r>
       <w:r>
         <w:rPr>
@@ -4826,7 +4918,7 @@
           <w:rStyle w:val="WorkNumber"/>
           <w:lang w:val="en-US"/>
         </w:rPr>
-        <w:t xml:space="preserve">48</w:t>
+        <w:t xml:space="preserve">49</w:t>
       </w:r>
       <w:r>
         <w:rPr>
@@ -4918,7 +5010,7 @@
           <w:rStyle w:val="WorkNumber"/>
           <w:lang w:val="en-US"/>
         </w:rPr>
-        <w:t xml:space="preserve">49</w:t>
+        <w:t xml:space="preserve">50</w:t>
       </w:r>
       <w:r>
         <w:rPr>
@@ -5049,7 +5141,7 @@
           <w:rStyle w:val="WorkNumber"/>
           <w:lang w:val="en-US"/>
         </w:rPr>
-        <w:t xml:space="preserve">50</w:t>
+        <w:t xml:space="preserve">51</w:t>
       </w:r>
       <w:r>
         <w:rPr>
@@ -5180,7 +5272,7 @@
           <w:rStyle w:val="WorkNumber"/>
           <w:lang w:val="en-US"/>
         </w:rPr>
-        <w:t xml:space="preserve">51</w:t>
+        <w:t xml:space="preserve">52</w:t>
       </w:r>
       <w:r>
         <w:rPr>
@@ -5272,7 +5364,7 @@
           <w:rStyle w:val="WorkNumber"/>
           <w:lang w:val="en-US"/>
         </w:rPr>
-        <w:t xml:space="preserve">52</w:t>
+        <w:t xml:space="preserve">53</w:t>
       </w:r>
       <w:r>
         <w:rPr>
@@ -5364,7 +5456,7 @@
           <w:rStyle w:val="WorkNumber"/>
           <w:lang w:val="en-US"/>
         </w:rPr>
-        <w:t xml:space="preserve">53</w:t>
+        <w:t xml:space="preserve">54</w:t>
       </w:r>
       <w:r>
         <w:rPr>
@@ -5456,7 +5548,7 @@
           <w:rStyle w:val="WorkNumber"/>
           <w:lang w:val="en-US"/>
         </w:rPr>
-        <w:t xml:space="preserve">54</w:t>
+        <w:t xml:space="preserve">55</w:t>
       </w:r>
       <w:r>
         <w:rPr>
@@ -5548,7 +5640,7 @@
           <w:rStyle w:val="WorkNumber"/>
           <w:lang w:val="en-US"/>
         </w:rPr>
-        <w:t xml:space="preserve">55</w:t>
+        <w:t xml:space="preserve">56</w:t>
       </w:r>
       <w:r>
         <w:rPr>
@@ -5640,7 +5732,7 @@
           <w:rStyle w:val="WorkNumber"/>
           <w:lang w:val="en-US"/>
         </w:rPr>
-        <w:t xml:space="preserve">56</w:t>
+        <w:t xml:space="preserve">57</w:t>
       </w:r>
       <w:r>
         <w:rPr>
@@ -5744,7 +5836,7 @@
           <w:rStyle w:val="WorkNumber"/>
           <w:lang w:val="en-US"/>
         </w:rPr>
-        <w:t xml:space="preserve">57</w:t>
+        <w:t xml:space="preserve">58</w:t>
       </w:r>
       <w:r>
         <w:rPr>
@@ -5836,7 +5928,7 @@
           <w:rStyle w:val="WorkNumber"/>
           <w:lang w:val="en-US"/>
         </w:rPr>
-        <w:t xml:space="preserve">58</w:t>
+        <w:t xml:space="preserve">59</w:t>
       </w:r>
       <w:r>
         <w:rPr>
@@ -5928,7 +6020,7 @@
           <w:rStyle w:val="WorkNumber"/>
           <w:lang w:val="en-US"/>
         </w:rPr>
-        <w:t xml:space="preserve">59</w:t>
+        <w:t xml:space="preserve">60</w:t>
       </w:r>
       <w:r>
         <w:rPr>
@@ -6020,7 +6112,7 @@
           <w:rStyle w:val="WorkNumber"/>
           <w:lang w:val="en-US"/>
         </w:rPr>
-        <w:t xml:space="preserve">60</w:t>
+        <w:t xml:space="preserve">61</w:t>
       </w:r>
       <w:r>
         <w:rPr>
@@ -6112,7 +6204,7 @@
           <w:rStyle w:val="WorkNumber"/>
           <w:lang w:val="en-US"/>
         </w:rPr>
-        <w:t xml:space="preserve">61</w:t>
+        <w:t xml:space="preserve">62</w:t>
       </w:r>
       <w:r>
         <w:rPr>
@@ -6204,7 +6296,7 @@
           <w:rStyle w:val="WorkNumber"/>
           <w:lang w:val="en-US"/>
         </w:rPr>
-        <w:t xml:space="preserve">62</w:t>
+        <w:t xml:space="preserve">63</w:t>
       </w:r>
       <w:r>
         <w:rPr>
@@ -6296,7 +6388,7 @@
           <w:rStyle w:val="WorkNumber"/>
           <w:lang w:val="en-US"/>
         </w:rPr>
-        <w:t xml:space="preserve">63</w:t>
+        <w:t xml:space="preserve">64</w:t>
       </w:r>
       <w:r>
         <w:rPr>
@@ -6388,7 +6480,7 @@
           <w:rStyle w:val="WorkNumber"/>
           <w:lang w:val="en-US"/>
         </w:rPr>
-        <w:t xml:space="preserve">64</w:t>
+        <w:t xml:space="preserve">65</w:t>
       </w:r>
       <w:r>
         <w:rPr>
@@ -6480,7 +6572,7 @@
           <w:rStyle w:val="WorkNumber"/>
           <w:lang w:val="en-US"/>
         </w:rPr>
-        <w:t xml:space="preserve">65</w:t>
+        <w:t xml:space="preserve">66</w:t>
       </w:r>
       <w:r>
         <w:rPr>

</xml_diff>